<commit_message>
sync feature importance wording between slides and report
</commit_message>
<xml_diff>
--- a/report.docx
+++ b/report.docx
@@ -1308,7 +1308,7 @@
           <w:rFonts w:ascii="Times New Roman" w:hAnsi="Times New Roman"/>
           <w:sz w:val="22"/>
         </w:rPr>
-        <w:t>Самый сильный одиночный сигнал — срок до заезда. Брони, оформленные за неделю до заезда, отменяют примерно в 10 % случаев; брони за 4–6 месяцев — почти в половине случаев. Видна почти монотонная зависимость, поэтому именно этот признак возглавляет любую оценку важности.</w:t>
+        <w:t>Самый сильный одиночный сигнал — срок до заезда. Брони, оформленные за неделю до заезда, отменяют примерно в 10 % случаев; брони за 4–6 месяцев — почти в половине случаев. Видна почти монотонная зависимость. Здесь речь именно об одиночной зависимости признака и цели; в обученной модели с остальными признаками картина важности отличается (см. раздел 7).</w:t>
       </w:r>
     </w:p>
     <w:p>
@@ -1843,6 +1843,32 @@
     </w:p>
     <w:p>
       <w:pPr>
+        <w:spacing w:after="80"/>
+        <w:ind w:firstLine="425"/>
+      </w:pPr>
+      <w:r>
+        <w:rPr>
+          <w:rFonts w:ascii="Times New Roman" w:hAnsi="Times New Roman"/>
+          <w:sz w:val="22"/>
+        </w:rPr>
+        <w:t>На графике в топе оказалась страна клиента, а не срок до заезда, как можно было бы ожидать после EDA. Это не противоречие, а другая постановка вопроса. EDA смотрит на одиночную различимость признака: насколько хорошо им одним можно разделить отменивших и доехавших. Permutation importance меряет уникальный вклад признака в обученной модели: насколько падает ROC-AUC, если конкретную колонку перемешать, а остальные оставить. Признак становится «важным», только если другие его не дублируют.</w:t>
+      </w:r>
+    </w:p>
+    <w:p>
+      <w:pPr>
+        <w:spacing w:after="80"/>
+        <w:ind w:firstLine="425"/>
+      </w:pPr>
+      <w:r>
+        <w:rPr>
+          <w:rFonts w:ascii="Times New Roman" w:hAnsi="Times New Roman"/>
+          <w:sz w:val="22"/>
+        </w:rPr>
+        <w:t>Срок до заезда коррелирует с каналом продажи (через короткие brides через прямые сайты, длинные — через онлайн-агентства), типом депозита, market_segment. Если его перемешать, модель восстанавливает часть сигнала через коррелирующие признаки, и падение AUC получается меньше. У страны клиента, закодированной через TargetEncoder, такого дублирования нет — она несёт уникальную информацию о доле отмен в каждой стране.</w:t>
+      </w:r>
+    </w:p>
+    <w:p>
+      <w:pPr>
         <w:spacing w:before="200" w:after="80"/>
       </w:pPr>
       <w:r>
@@ -2033,7 +2059,20 @@
           <w:rFonts w:ascii="Times New Roman" w:hAnsi="Times New Roman"/>
           <w:sz w:val="22"/>
         </w:rPr>
-        <w:t>Удалось получить устойчивую модель с ROC-AUC = 0.917 на отложенном тесте. Главные сигналы — срок до заезда, тип депозита, страна клиента и канал продаж. Финальная модель сохранена в виде pickle-файла и подключена к Streamlit-приложению, которое демонстрирует работу на конкретных бронях. Все этапы — чистка данных, инжиниринг признаков, валидация и анализ ошибок — выполнены в пяти тематических Jupyter-ноутбуках, код переиспользуемой логики вынесен в модули src/data.py и src/features.py.</w:t>
+        <w:t>Удалось получить устойчивую модель с ROC-AUC = 0.917 на отложенном тесте. По одиночной зависимости главным сигналом остаётся срок до заезда, в полной модели по permutation importance на первый план выходит страна клиента — это разные постановки вопроса и они согласованы между собой (см. раздел 7).</w:t>
+      </w:r>
+    </w:p>
+    <w:p>
+      <w:pPr>
+        <w:spacing w:after="80"/>
+        <w:ind w:firstLine="425"/>
+      </w:pPr>
+      <w:r>
+        <w:rPr>
+          <w:rFonts w:ascii="Times New Roman" w:hAnsi="Times New Roman"/>
+          <w:sz w:val="22"/>
+        </w:rPr>
+        <w:t>Финальная модель сохранена в виде pickle-файла и подключена к Streamlit-приложению, которое показывает работу на конкретных бронях. Все этапы — чистка данных, инжиниринг признаков, валидация и анализ ошибок — выполнены в пяти тематических Jupyter-ноутбуках, переиспользуемая логика вынесена в модули src/data.py и src/features.py.</w:t>
       </w:r>
     </w:p>
     <w:sectPr>

</xml_diff>